<commit_message>
v2.8 보완: 감사 수정 (정합성·SF-36 reference·매뉴얼 sample)
- af-outcomes.md: QOL(SF-36 cited) §1.4·§3.1 매핑표 추가(§99-T 완성), 헤더 갱신
- cpg SKILL.md: 6B 모호케이스 체크리스트에 v2.7/v2.8 항목 반영, 7B/7C 순서 교정, 2F/2G 헤더 버전태그 정리
- 매뉴얼 v2.8.docx: 본문 sample_v2.7→v2.8 5곳(잔존 참조 제거)
- upgrade v2.6.1_changes.md: last_actor 버전 일반화

Co-Authored-By: Claude Opus 4.8 <noreply@anthropic.com>
</commit_message>
<xml_diff>
--- a/01_매뉴얼/AF_CPG_데이터추출_매뉴얼_v2.8.docx
+++ b/01_매뉴얼/AF_CPG_데이터추출_매뉴얼_v2.8.docx
@@ -2092,7 +2092,7 @@
           <w:sz w:val="20"/>
           <w:szCs w:val="20"/>
         </w:rPr>
-        <w:t>- 엑셀 생성 시 sample_v2.7.xlsx를 읽어 동일한 열 구조·서식으로 출력한다.</w:t>
+        <w:t>- 엑셀 생성 시 sample_v2.8.xlsx를 읽어 동일한 열 구조·서식으로 출력한다.</w:t>
       </w:r>
     </w:p>
     <w:p>
@@ -3398,7 +3398,7 @@
           <w:sz w:val="22"/>
           <w:szCs w:val="22"/>
         </w:rPr>
-        <w:t>작업자가 "저장해줘" 또는 "엑셀 만들어줘"라고 지시하면, Claude가 sample_v2.7.xlsx의 열 구조·서식을 그대로 따라 단독 파일로 저장한다.</w:t>
+        <w:t>작업자가 "저장해줘" 또는 "엑셀 만들어줘"라고 지시하면, Claude가 sample_v2.8.xlsx의 열 구조·서식을 그대로 따라 단독 파일로 저장한다.</w:t>
       </w:r>
     </w:p>
     <w:p>
@@ -5285,7 +5285,7 @@
                 <w:sz w:val="20"/>
                 <w:szCs w:val="20"/>
               </w:rPr>
-              <w:t>추출 파일을 sample_v2.7.xlsx 기준으로 재추출</w:t>
+              <w:t>추출 파일을 sample_v2.8.xlsx 기준으로 재추출</w:t>
             </w:r>
           </w:p>
         </w:tc>
@@ -15888,7 +15888,7 @@
           <w:sz w:val="22"/>
           <w:szCs w:val="22"/>
         </w:rPr>
-        <w:t>→ sample_v2.7.xlsx가 skills 폴더에 포함되어 있는지 확인한다. Claude가 이 샘플을 참조해야 동일한 형식으로 출력된다.</w:t>
+        <w:t>→ sample_v2.8.xlsx가 skills 폴더에 포함되어 있는지 확인한다. Claude가 이 샘플을 참조해야 동일한 형식으로 출력된다.</w:t>
       </w:r>
     </w:p>
     <w:p>
@@ -16024,7 +16024,7 @@
           <w:sz w:val="22"/>
           <w:szCs w:val="22"/>
         </w:rPr>
-        <w:t>→ 3-4의 거부 표를 확인한다. 대부분 헤더/시트 구성 불일치 또는 sample_v2.7.xlsx 기준 미준수가 원인이다. 사유에 맞춰 재추출 후 다음 머지에 다시 포함된다.</w:t>
+        <w:t>→ 3-4의 거부 표를 확인한다. 대부분 헤더/시트 구성 불일치 또는 sample_v2.8.xlsx 기준 미준수가 원인이다. 사유에 맞춰 재추출 후 다음 머지에 다시 포함된다.</w:t>
       </w:r>
     </w:p>
     <w:p>

</xml_diff>